<commit_message>
提交前最小修复：回复信 FAC 训练池 1,118→1,706 事实冲突修正（R3C4），R1 补双池说明（主 adapter 1,118 / strong-residual-FAC 1,706），收窄 every transfer claim 与 exact checkpoint identifiers 表述；关键词 7→6（删 texture quality assessment，适配 EM 表单上限），重编译正文 15pp/0 错、marked-up 16pp/0 ??，重生成回复信 8pp、合并稿 23pp、latex.zip（tex md5 已核）
</commit_message>
<xml_diff>
--- a/final/submission_new_0907/response to comments of reviewers 0907.docx
+++ b/final/submission_new_0907/response to comments of reviewers 0907.docx
@@ -363,7 +363,7 @@
         </w:numPr>
       </w:pPr>
       <w:r>
-        <w:t xml:space="preserve">We clarified the data splits and disclosed the probe/holdout structure. Section 4.1 now documents the complete data pipeline: all objects are drawn from the Objaverse 3D asset collection; ground-truth multi-view images are rendered offline with Blender (Cycles engine, 17 views at 512×512, white background); the adapter training pool contains 1,118 rendered objects and the evaluation pool contains 300 rendered objects, and we verified that the two identifier sets intersect in zero objects, so no evaluation object was seen during adapter training. We additionally disclose that the 24-object probe set (obj_0000–obj_0023) is part of the 300-object pool, and every transfer claim is now also verified on the strictly disjoint 276-object holdout (obj_0024–obj_0299). The 50-object scale-sweep set, the 26-object texture-audit set, the 50-object CLIP-IQA subset, and the 30-object preference-study subset are all subsets of the 300-object pool, and no training object appears in any of them. (Please see the</w:t>
+        <w:t xml:space="preserve">We clarified the data splits and disclosed the probe/holdout structure. Section 4.1 now documents the complete data pipeline: all objects are drawn from the Objaverse 3D asset collection; ground-truth multi-view images are rendered offline with Blender (Cycles engine, 17 views at 512×512, white background); the main adapter’s training pool contains 1,118 rendered objects, while the strong-residual, per-layer-capped adapter instance used in Section 4.7 and the FAC experiments is trained on a separate 1,706-object pool from the same source; the evaluation pool contains 300 rendered objects, and we verified that the training and evaluation identifier sets intersect in zero objects, so no evaluation object was seen during adapter training. We additionally disclose that the 24-object probe set (obj_0000–obj_0023) is part of the 300-object pool, and the scheduling-comparison claims are additionally re-verified on the strictly disjoint 276-object holdout (obj_0024–obj_0299) using the strong-residual, per-layer-capped adapter instance. The 50-object scale-sweep set, the 26-object texture-audit set, the 50-object CLIP-IQA subset, and the 30-object preference-study subset are all subsets of the 300-object pool, and no training object appears in any of them. (Please see the</w:t>
       </w:r>
       <w:r>
         <w:t xml:space="preserve"> </w:t>
@@ -430,7 +430,7 @@
         <w:t xml:space="preserve"> </w:t>
       </w:r>
       <w:r>
-        <w:t xml:space="preserve">subsection (Section 4.1.3) with a consolidated reproducibility reference. It specifies: the base pipeline (an MVPainter-style geometry-controlled multi-view diffusion model built on a joint six-view latent UNet, used frozen together with its VAE); the adapter input (a five-channel geometric input of a 3-channel normal map, a 1-channel depth map, and a 1-channel foreground mask) and its multi-scale injection into multiple UNet resolution levels; the adapter checkpoint used for all tables and its scale semantics (the requested scale is applied multiplicatively at every injected layer); the sampler and scheduler (Euler discrete, 50 denoising steps); the fixed random seed (42) shared by all schedules within an experiment, so all variants share the same initial latents; the six target views and the ground-truth rendering configuration; and the exact metric implementations (foreground-masked FG-SSIM/Edge-SSIM/PSNR, edge masks derived from depth/normal discontinuities, LPIPS with the AlexNet backbone, and foreground Laplacian-variance/RGB-std/gradient-magnitude diagnostics computed under identical views and masks). The pipeline is reference-image-conditioned; no text prompts are used. In addition, the supplementary material now contains a consolidated reproducibility table listing the data source and subsets, the exact base-pipeline and adapter checkpoint identifiers, the scheduler, steps, seed, conditioning, resolution, and metric implementations. (Please see Section 4.1 of the manuscript and the reproducibility table in the supplementary material.)</w:t>
+        <w:t xml:space="preserve">subsection (Section 4.1.3) with a consolidated reproducibility reference. It specifies: the base pipeline (an MVPainter-style geometry-controlled multi-view diffusion model built on a joint six-view latent UNet, used frozen together with its VAE); the adapter input (a five-channel geometric input of a 3-channel normal map, a 1-channel depth map, and a 1-channel foreground mask) and its multi-scale injection into multiple UNet resolution levels; the adapter checkpoint used for all tables and its scale semantics (the requested scale is applied multiplicatively at every injected layer); the sampler and scheduler (Euler discrete, 50 denoising steps); the fixed random seed (42) shared by all schedules within an experiment, so all variants share the same initial latents; the six target views and the ground-truth rendering configuration; and the exact metric implementations (foreground-masked FG-SSIM/Edge-SSIM/PSNR, edge masks derived from depth/normal discontinuities, LPIPS with the AlexNet backbone, and foreground Laplacian-variance/RGB-std/gradient-magnitude diagnostics computed under identical views and masks). The pipeline is reference-image-conditioned; no text prompts are used. In addition, the supplementary material now contains a consolidated reproducibility table listing the data source and subsets, the base-pipeline and adapter checkpoint file names and settings, the scheduler, steps, seed, conditioning, resolution, and metric implementations. (Please see Section 4.1 of the manuscript and the reproducibility table in the supplementary material.)</w:t>
       </w:r>
     </w:p>
     <w:p>
@@ -688,7 +688,7 @@
         <w:pStyle w:val="BodyText"/>
       </w:pPr>
       <w:r>
-        <w:t xml:space="preserve">Response: Thank you for this comment. The dataset and implementation details, including the verified zero train–eval overlap, are provided in Section 4.1 (please see our responses to Comments 1 and 2 of Reviewer 1). For FAC, Section 4.6 now specifies exactly what is requested: training data (the 1,118-object adapter training pool, strictly disjoint from all evaluation objects; no evaluation object is used for training or model selection), loss (the same enhanced denoising objective as the base adapter, specified in Section 4.6), optimization (AdamW, peak learning rate 10^-4, 2,000 steps), parameter count (roughly 6×10³ trainable parameters), and the strictly paired evaluation with a warm-start control. The controlled outcome and its scoped interpretation are reported in the manuscript, and the training-free TCAS remains the main and sole method. (Please see Section 4.6 of the manuscript.)</w:t>
+        <w:t xml:space="preserve">Response: Thank you for this comment. The dataset and implementation details, including the verified zero train–eval overlap, are provided in Section 4.1 (please see our responses to Comments 1 and 2 of Reviewer 1). For FAC, Section 4.6 now specifies exactly what is requested: training data (the separate 1,706-object adapter training pool used by the strong-residual instance on which FAC builds, strictly disjoint from all evaluation objects; no evaluation object is used for training or model selection), loss (the same enhanced denoising objective as the base adapter, specified in Section 4.6), optimization (AdamW, peak learning rate 10^-4, 2,000 steps), parameter count (roughly 6×10³ trainable parameters), and the strictly paired evaluation with a warm-start control. The controlled outcome and its scoped interpretation are reported in the manuscript, and the training-free TCAS remains the main and sole method. (Please see Section 4.6 of the manuscript.)</w:t>
       </w:r>
     </w:p>
     <w:p>

</xml_diff>